<commit_message>
Add IK1-deduped MSG HNSW handout builder and update paper docs.
Dedupe full 11540 pack to 1 spectrum per InChIKey first block per official fold (n=1780; train/val/test 1652/75/53). Document paths, policy, and cost guidance in METHODS/RESULTS/HANDOFF Word+MD.
</commit_message>
<xml_diff>
--- a/paper/HANDOFF_ALEXANDER.docx
+++ b/paper/HANDOFF_ALEXANDER.docx
@@ -351,6 +351,28 @@
           </w:tcPr>
           <w:p>
             <w:r>
+              <w:t>IK1 dedupe handout</w:t>
+            </w:r>
+          </w:p>
+        </w:tc>
+        <w:tc>
+          <w:tcPr>
+            <w:tcW w:type="dxa" w:w="4320"/>
+          </w:tcPr>
+          <w:p>
+            <w:r>
+              <w:t>scripts/dedupe_msg_hnsw_handout_by_ik1.py</w:t>
+            </w:r>
+          </w:p>
+        </w:tc>
+      </w:tr>
+      <w:tr>
+        <w:tc>
+          <w:tcPr>
+            <w:tcW w:type="dxa" w:w="4320"/>
+          </w:tcPr>
+          <w:p>
+            <w:r>
               <w:t>Free-form runners</w:t>
             </w:r>
           </w:p>
@@ -584,7 +606,7 @@
           </w:tcPr>
           <w:p>
             <w:r>
-              <w:t>Grok prompts zip</w:t>
+              <w:t>Grok prompts zip (full)</w:t>
             </w:r>
           </w:p>
         </w:tc>
@@ -595,6 +617,94 @@
           <w:p>
             <w:r>
               <w:t>Desktop\MSG_HNSW_full11540_nist_neigh_GROK_handout.zip</w:t>
+            </w:r>
+          </w:p>
+        </w:tc>
+      </w:tr>
+      <w:tr>
+        <w:tc>
+          <w:tcPr>
+            <w:tcW w:type="dxa" w:w="4320"/>
+          </w:tcPr>
+          <w:p>
+            <w:r>
+              <w:t>IK1-deduped handout (n=1780)</w:t>
+            </w:r>
+          </w:p>
+        </w:tc>
+        <w:tc>
+          <w:tcPr>
+            <w:tcW w:type="dxa" w:w="4320"/>
+          </w:tcPr>
+          <w:p>
+            <w:r>
+              <w:t>Desktop\MSG_HNSW_dedup_ik1_nist_neigh_handout</w:t>
+            </w:r>
+          </w:p>
+        </w:tc>
+      </w:tr>
+      <w:tr>
+        <w:tc>
+          <w:tcPr>
+            <w:tcW w:type="dxa" w:w="4320"/>
+          </w:tcPr>
+          <w:p>
+            <w:r>
+              <w:t>IK1-deduped sealed</w:t>
+            </w:r>
+          </w:p>
+        </w:tc>
+        <w:tc>
+          <w:tcPr>
+            <w:tcW w:type="dxa" w:w="4320"/>
+          </w:tcPr>
+          <w:p>
+            <w:r>
+              <w:t>Desktop\MSG_HNSW_dedup_ik1_nist_neigh_SEALED_truth</w:t>
+            </w:r>
+          </w:p>
+        </w:tc>
+      </w:tr>
+      <w:tr>
+        <w:tc>
+          <w:tcPr>
+            <w:tcW w:type="dxa" w:w="4320"/>
+          </w:tcPr>
+          <w:p>
+            <w:r>
+              <w:t>Grok zip (deduped)</w:t>
+            </w:r>
+          </w:p>
+        </w:tc>
+        <w:tc>
+          <w:tcPr>
+            <w:tcW w:type="dxa" w:w="4320"/>
+          </w:tcPr>
+          <w:p>
+            <w:r>
+              <w:t>Desktop\MSG_HNSW_dedup_ik1_nist_neigh_GROK_handout.zip</w:t>
+            </w:r>
+          </w:p>
+        </w:tc>
+      </w:tr>
+      <w:tr>
+        <w:tc>
+          <w:tcPr>
+            <w:tcW w:type="dxa" w:w="4320"/>
+          </w:tcPr>
+          <w:p>
+            <w:r>
+              <w:t>Dedupe script</w:t>
+            </w:r>
+          </w:p>
+        </w:tc>
+        <w:tc>
+          <w:tcPr>
+            <w:tcW w:type="dxa" w:w="4320"/>
+          </w:tcPr>
+          <w:p>
+            <w:r>
+              <w:t>scripts/dedupe_msg_hnsw_handout_by_ik1.py</w:t>
             </w:r>
           </w:p>
         </w:tc>
@@ -751,7 +861,15 @@
         <w:pStyle w:val="ListBullet"/>
       </w:pPr>
       <w:r>
-        <w:t>Redundancy: 11,540 spectra → 1781 unique IK1 (~6.5×).</w:t>
+        <w:t>Redundancy: 11,540 spectra → 1780 unique IK1 (~6.5×).</w:t>
+      </w:r>
+    </w:p>
+    <w:p>
+      <w:pPr>
+        <w:pStyle w:val="ListBullet"/>
+      </w:pPr>
+      <w:r>
+        <w:t>IK1-deduped pack ready: n=1780 (train 1652 / val 75 / test 53) — prefer for free-form API.</w:t>
       </w:r>
     </w:p>
     <w:p>
@@ -823,7 +941,7 @@
         <w:pStyle w:val="ListBullet"/>
       </w:pPr>
       <w:r>
-        <w:t>Deduped free-form pilot: 1 spectrum per IK1 (~1781) on 11,540 block.</w:t>
+        <w:t>Free-form on deduped pack (n=1780; train 1652 / val 75 / test 53) or start with ids_test.txt (n=53).</w:t>
       </w:r>
     </w:p>
     <w:p>

</xml_diff>

<commit_message>
Add test-only MSG HNSW handout (n=64, no IK1 dedupe).
Preferred free-form set: official fold=test from the HNSW block with original test count preserved. Subset script copies parent NIST prompts; paper docs point to MSG_HNSW_test64_* artifacts.
</commit_message>
<xml_diff>
--- a/paper/HANDOFF_ALEXANDER.docx
+++ b/paper/HANDOFF_ALEXANDER.docx
@@ -351,7 +351,29 @@
           </w:tcPr>
           <w:p>
             <w:r>
-              <w:t>IK1 dedupe handout</w:t>
+              <w:t>Fold subset (test64)</w:t>
+            </w:r>
+          </w:p>
+        </w:tc>
+        <w:tc>
+          <w:tcPr>
+            <w:tcW w:type="dxa" w:w="4320"/>
+          </w:tcPr>
+          <w:p>
+            <w:r>
+              <w:t>scripts/subset_msg_hnsw_handout_by_fold.py</w:t>
+            </w:r>
+          </w:p>
+        </w:tc>
+      </w:tr>
+      <w:tr>
+        <w:tc>
+          <w:tcPr>
+            <w:tcW w:type="dxa" w:w="4320"/>
+          </w:tcPr>
+          <w:p>
+            <w:r>
+              <w:t>IK1 dedupe handout (optional)</w:t>
             </w:r>
           </w:p>
         </w:tc>
@@ -628,7 +650,7 @@
           </w:tcPr>
           <w:p>
             <w:r>
-              <w:t>IK1-deduped handout (n=1780)</w:t>
+              <w:t>Test-only handout (n=64, no dedupe)</w:t>
             </w:r>
           </w:p>
         </w:tc>
@@ -638,7 +660,7 @@
           </w:tcPr>
           <w:p>
             <w:r>
-              <w:t>Desktop\MSG_HNSW_dedup_ik1_nist_neigh_handout</w:t>
+              <w:t>Desktop\MSG_HNSW_test64_nist_neigh_handout</w:t>
             </w:r>
           </w:p>
         </w:tc>
@@ -650,7 +672,7 @@
           </w:tcPr>
           <w:p>
             <w:r>
-              <w:t>IK1-deduped sealed</w:t>
+              <w:t>Test-only sealed</w:t>
             </w:r>
           </w:p>
         </w:tc>
@@ -660,7 +682,7 @@
           </w:tcPr>
           <w:p>
             <w:r>
-              <w:t>Desktop\MSG_HNSW_dedup_ik1_nist_neigh_SEALED_truth</w:t>
+              <w:t>Desktop\MSG_HNSW_test64_nist_neigh_SEALED_truth</w:t>
             </w:r>
           </w:p>
         </w:tc>
@@ -672,7 +694,7 @@
           </w:tcPr>
           <w:p>
             <w:r>
-              <w:t>Grok zip (deduped)</w:t>
+              <w:t>Grok zip (test64)</w:t>
             </w:r>
           </w:p>
         </w:tc>
@@ -682,7 +704,51 @@
           </w:tcPr>
           <w:p>
             <w:r>
-              <w:t>Desktop\MSG_HNSW_dedup_ik1_nist_neigh_GROK_handout.zip</w:t>
+              <w:t>Desktop\MSG_HNSW_test64_nist_neigh_GROK_handout.zip</w:t>
+            </w:r>
+          </w:p>
+        </w:tc>
+      </w:tr>
+      <w:tr>
+        <w:tc>
+          <w:tcPr>
+            <w:tcW w:type="dxa" w:w="4320"/>
+          </w:tcPr>
+          <w:p>
+            <w:r>
+              <w:t>Fold subset script</w:t>
+            </w:r>
+          </w:p>
+        </w:tc>
+        <w:tc>
+          <w:tcPr>
+            <w:tcW w:type="dxa" w:w="4320"/>
+          </w:tcPr>
+          <w:p>
+            <w:r>
+              <w:t>scripts/subset_msg_hnsw_handout_by_fold.py</w:t>
+            </w:r>
+          </w:p>
+        </w:tc>
+      </w:tr>
+      <w:tr>
+        <w:tc>
+          <w:tcPr>
+            <w:tcW w:type="dxa" w:w="4320"/>
+          </w:tcPr>
+          <w:p>
+            <w:r>
+              <w:t>IK1-deduped optional (n=1780)</w:t>
+            </w:r>
+          </w:p>
+        </w:tc>
+        <w:tc>
+          <w:tcPr>
+            <w:tcW w:type="dxa" w:w="4320"/>
+          </w:tcPr>
+          <w:p>
+            <w:r>
+              <w:t>Desktop\MSG_HNSW_dedup_ik1_nist_neigh_handout</w:t>
             </w:r>
           </w:p>
         </w:tc>
@@ -869,7 +935,7 @@
         <w:pStyle w:val="ListBullet"/>
       </w:pPr>
       <w:r>
-        <w:t>IK1-deduped pack ready: n=1780 (train 1652 / val 75 / test 53) — prefer for free-form API.</w:t>
+        <w:t>Preferred free-form handout: test-only n=64 (original test count, no IK1 dedupe).</w:t>
       </w:r>
     </w:p>
     <w:p>

</xml_diff>